<commit_message>
fix: upgrade typescript to 6.0.3 and fix DueDatePicker event types
</commit_message>
<xml_diff>
--- a/Qe190161_Exam1.docx .docx
+++ b/Qe190161_Exam1.docx .docx
@@ -131,18 +131,6 @@
                 <w:color w:val="DC2626"/>
               </w:rPr>
               <w:t>Qe190161</w:t>
-            </w:r>
-          </w:p>
-          <w:p>
-            <w:r>
-              <w:rPr>
-                <w:b/>
-                <w:bCs/>
-              </w:rPr>
-              <w:t xml:space="preserve">• Tên file nộp bài: </w:t>
-            </w:r>
-            <w:r>
-              <w:t>[StudentID]_Exam1.docx (Ví dụ: SE123456_Exam1.docx)</w:t>
             </w:r>
           </w:p>
         </w:tc>

</xml_diff>

<commit_message>
chore(docs): update docx files after performance optimizations
</commit_message>
<xml_diff>
--- a/Qe190161_Exam1.docx .docx
+++ b/Qe190161_Exam1.docx .docx
@@ -55,12 +55,6 @@
         <w:gridCol w:w="9020"/>
       </w:tblGrid>
       <w:tr>
-        <w:tblPrEx>
-          <w:tblCellMar>
-            <w:top w:w="0" w:type="dxa"/>
-            <w:bottom w:w="0" w:type="dxa"/>
-          </w:tblCellMar>
-        </w:tblPrEx>
         <w:tc>
           <w:tcPr>
             <w:tcW w:w="5000" w:type="pct"/>
@@ -168,38 +162,137 @@
           <w:color w:val="2563EB"/>
           <w:u w:val="single"/>
         </w:rPr>
-        <w:t>[Dán link GitHub repo của bạn ở đây, ví dụ: https://github.com/username/task-management-app]</w:t>
-      </w:r>
-    </w:p>
-    <w:p>
-      <w:pPr>
-        <w:spacing w:after="80"/>
-      </w:pPr>
-      <w:r>
-        <w:rPr>
-          <w:b/>
-          <w:bCs/>
-        </w:rPr>
-        <w:t xml:space="preserve">• Cam kết số lượng commit: </w:t>
-      </w:r>
-      <w:r>
-        <w:t>Tối thiểu 7 commits tuân thủ Conventional Commits (chore:, feat:, docs:, refactor:).</w:t>
+        <w:t>https://github.com/phongnha230/Task_MMA_exe1</w:t>
       </w:r>
     </w:p>
     <w:p>
       <w:pPr>
         <w:spacing w:after="200"/>
-      </w:pPr>
-      <w:r>
-        <w:rPr>
-          <w:b/>
-          <w:bCs/>
-        </w:rPr>
-        <w:t xml:space="preserve">• Expo Project Link / QR Code: </w:t>
-      </w:r>
-      <w:r>
-        <w:t>[Dán link Expo hoặc ảnh chụp mã QR khi chạy npx expo start]</w:t>
-      </w:r>
+        <w:rPr>
+          <w:b/>
+          <w:bCs/>
+        </w:rPr>
+      </w:pPr>
+      <w:r>
+        <w:rPr>
+          <w:b/>
+          <w:bCs/>
+        </w:rPr>
+        <w:t xml:space="preserve">• Expo Project </w:t>
+      </w:r>
+      <w:r>
+        <w:rPr>
+          <w:b/>
+          <w:bCs/>
+        </w:rPr>
+        <w:t xml:space="preserve">Link: </w:t>
+      </w:r>
+      <w:r>
+        <w:rPr>
+          <w:b/>
+          <w:bCs/>
+          <w:color w:val="4472C4" w:themeColor="accent1"/>
+        </w:rPr>
+        <w:t>https://expo.dev/accounts/nha1905/projects/notion-app/builds/9e1def97-d3e3-41a9-9013-879c4c32c661</w:t>
+      </w:r>
+    </w:p>
+    <w:p>
+      <w:pPr>
+        <w:spacing w:after="200"/>
+        <w:rPr>
+          <w:b/>
+          <w:bCs/>
+        </w:rPr>
+      </w:pPr>
+      <w:r>
+        <w:rPr>
+          <w:b/>
+          <w:bCs/>
+        </w:rPr>
+        <w:t xml:space="preserve">QR </w:t>
+      </w:r>
+      <w:r>
+        <w:rPr>
+          <w:b/>
+          <w:bCs/>
+        </w:rPr>
+        <w:t>Code:</w:t>
+      </w:r>
+    </w:p>
+    <w:p>
+      <w:pPr>
+        <w:spacing w:after="200"/>
+        <w:rPr>
+          <w:b/>
+          <w:bCs/>
+        </w:rPr>
+      </w:pPr>
+      <w:r>
+        <w:rPr>
+          <w:b/>
+          <w:bCs/>
+        </w:rPr>
+        <w:t xml:space="preserve"> </w:t>
+      </w:r>
+      <w:r>
+        <w:rPr>
+          <w:b/>
+          <w:bCs/>
+        </w:rPr>
+        <w:drawing>
+          <wp:inline distT="0" distB="0" distL="0" distR="0" wp14:anchorId="724275F1" wp14:editId="32C7877D">
+            <wp:extent cx="1835150" cy="1835150"/>
+            <wp:effectExtent l="0" t="0" r="0" b="0"/>
+            <wp:docPr id="827956406" name="Picture 4"/>
+            <wp:cNvGraphicFramePr>
+              <a:graphicFrameLocks xmlns:a="http://schemas.openxmlformats.org/drawingml/2006/main" noChangeAspect="1"/>
+            </wp:cNvGraphicFramePr>
+            <a:graphic xmlns:a="http://schemas.openxmlformats.org/drawingml/2006/main">
+              <a:graphicData uri="http://schemas.openxmlformats.org/drawingml/2006/picture">
+                <pic:pic xmlns:pic="http://schemas.openxmlformats.org/drawingml/2006/picture">
+                  <pic:nvPicPr>
+                    <pic:cNvPr id="0" name="Picture 9"/>
+                    <pic:cNvPicPr>
+                      <a:picLocks noChangeAspect="1" noChangeArrowheads="1"/>
+                    </pic:cNvPicPr>
+                  </pic:nvPicPr>
+                  <pic:blipFill>
+                    <a:blip r:embed="rId5">
+                      <a:extLst>
+                        <a:ext uri="{28A0092B-C50C-407E-A947-70E740481C1C}">
+                          <a14:useLocalDpi xmlns:a14="http://schemas.microsoft.com/office/drawing/2010/main" val="0"/>
+                        </a:ext>
+                      </a:extLst>
+                    </a:blip>
+                    <a:srcRect/>
+                    <a:stretch>
+                      <a:fillRect/>
+                    </a:stretch>
+                  </pic:blipFill>
+                  <pic:spPr bwMode="auto">
+                    <a:xfrm>
+                      <a:off x="0" y="0"/>
+                      <a:ext cx="1835150" cy="1835150"/>
+                    </a:xfrm>
+                    <a:prstGeom prst="rect">
+                      <a:avLst/>
+                    </a:prstGeom>
+                    <a:noFill/>
+                    <a:ln>
+                      <a:noFill/>
+                    </a:ln>
+                  </pic:spPr>
+                </pic:pic>
+              </a:graphicData>
+            </a:graphic>
+          </wp:inline>
+        </w:drawing>
+      </w:r>
+    </w:p>
+    <w:p>
+      <w:pPr>
+        <w:spacing w:after="200"/>
+      </w:pPr>
     </w:p>
     <w:p>
       <w:pPr>
@@ -260,12 +353,6 @@
         <w:gridCol w:w="4061"/>
       </w:tblGrid>
       <w:tr>
-        <w:tblPrEx>
-          <w:tblCellMar>
-            <w:top w:w="0" w:type="dxa"/>
-            <w:bottom w:w="0" w:type="dxa"/>
-          </w:tblCellMar>
-        </w:tblPrEx>
         <w:tc>
           <w:tcPr>
             <w:tcW w:w="1000" w:type="pct"/>
@@ -400,12 +487,6 @@
         </w:tc>
       </w:tr>
       <w:tr>
-        <w:tblPrEx>
-          <w:tblCellMar>
-            <w:top w:w="0" w:type="dxa"/>
-            <w:bottom w:w="0" w:type="dxa"/>
-          </w:tblCellMar>
-        </w:tblPrEx>
         <w:tc>
           <w:tcPr>
             <w:tcW w:w="1000" w:type="pct"/>
@@ -517,12 +598,6 @@
         </w:tc>
       </w:tr>
       <w:tr>
-        <w:tblPrEx>
-          <w:tblCellMar>
-            <w:top w:w="0" w:type="dxa"/>
-            <w:bottom w:w="0" w:type="dxa"/>
-          </w:tblCellMar>
-        </w:tblPrEx>
         <w:tc>
           <w:tcPr>
             <w:tcW w:w="1000" w:type="pct"/>
@@ -634,12 +709,6 @@
         </w:tc>
       </w:tr>
       <w:tr>
-        <w:tblPrEx>
-          <w:tblCellMar>
-            <w:top w:w="0" w:type="dxa"/>
-            <w:bottom w:w="0" w:type="dxa"/>
-          </w:tblCellMar>
-        </w:tblPrEx>
         <w:tc>
           <w:tcPr>
             <w:tcW w:w="1000" w:type="pct"/>
@@ -751,12 +820,6 @@
         </w:tc>
       </w:tr>
       <w:tr>
-        <w:tblPrEx>
-          <w:tblCellMar>
-            <w:top w:w="0" w:type="dxa"/>
-            <w:bottom w:w="0" w:type="dxa"/>
-          </w:tblCellMar>
-        </w:tblPrEx>
         <w:tc>
           <w:tcPr>
             <w:tcW w:w="1000" w:type="pct"/>
@@ -868,12 +931,6 @@
         </w:tc>
       </w:tr>
       <w:tr>
-        <w:tblPrEx>
-          <w:tblCellMar>
-            <w:top w:w="0" w:type="dxa"/>
-            <w:bottom w:w="0" w:type="dxa"/>
-          </w:tblCellMar>
-        </w:tblPrEx>
         <w:tc>
           <w:tcPr>
             <w:tcW w:w="1000" w:type="pct"/>
@@ -985,12 +1042,6 @@
         </w:tc>
       </w:tr>
       <w:tr>
-        <w:tblPrEx>
-          <w:tblCellMar>
-            <w:top w:w="0" w:type="dxa"/>
-            <w:bottom w:w="0" w:type="dxa"/>
-          </w:tblCellMar>
-        </w:tblPrEx>
         <w:tc>
           <w:tcPr>
             <w:tcW w:w="1000" w:type="pct"/>
@@ -1102,12 +1153,6 @@
         </w:tc>
       </w:tr>
       <w:tr>
-        <w:tblPrEx>
-          <w:tblCellMar>
-            <w:top w:w="0" w:type="dxa"/>
-            <w:bottom w:w="0" w:type="dxa"/>
-          </w:tblCellMar>
-        </w:tblPrEx>
         <w:tc>
           <w:tcPr>
             <w:tcW w:w="1000" w:type="pct"/>
@@ -1132,6 +1177,7 @@
                 <w:sz w:val="19"/>
                 <w:szCs w:val="19"/>
               </w:rPr>
+              <w:lastRenderedPageBreak/>
               <w:t>createdAt</w:t>
             </w:r>
           </w:p>
@@ -1219,12 +1265,6 @@
         </w:tc>
       </w:tr>
       <w:tr>
-        <w:tblPrEx>
-          <w:tblCellMar>
-            <w:top w:w="0" w:type="dxa"/>
-            <w:bottom w:w="0" w:type="dxa"/>
-          </w:tblCellMar>
-        </w:tblPrEx>
         <w:tc>
           <w:tcPr>
             <w:tcW w:w="1000" w:type="pct"/>
@@ -1336,12 +1376,6 @@
         </w:tc>
       </w:tr>
       <w:tr>
-        <w:tblPrEx>
-          <w:tblCellMar>
-            <w:top w:w="0" w:type="dxa"/>
-            <w:bottom w:w="0" w:type="dxa"/>
-          </w:tblCellMar>
-        </w:tblPrEx>
         <w:tc>
           <w:tcPr>
             <w:tcW w:w="1000" w:type="pct"/>
@@ -1453,12 +1487,6 @@
         </w:tc>
       </w:tr>
       <w:tr>
-        <w:tblPrEx>
-          <w:tblCellMar>
-            <w:top w:w="0" w:type="dxa"/>
-            <w:bottom w:w="0" w:type="dxa"/>
-          </w:tblCellMar>
-        </w:tblPrEx>
         <w:tc>
           <w:tcPr>
             <w:tcW w:w="1000" w:type="pct"/>
@@ -1583,7 +1611,6 @@
           <w:sz w:val="26"/>
           <w:szCs w:val="26"/>
         </w:rPr>
-        <w:lastRenderedPageBreak/>
         <w:t>3. DANH SÁCH ẢNH CHỤP MÀN HÌNH MINH CHỨNG (SCREENSHOTS CHECKLIST)</w:t>
       </w:r>
     </w:p>
@@ -1613,82 +1640,6 @@
         <w:t>3.1. Ảnh 1: Cấu hình Cloud Firestore Database trên Firebase Console</w:t>
       </w:r>
     </w:p>
-    <w:tbl>
-      <w:tblPr>
-        <w:tblW w:w="5000" w:type="pct"/>
-        <w:tblBorders>
-          <w:top w:val="single" w:sz="4" w:space="0" w:color="auto"/>
-          <w:left w:val="single" w:sz="4" w:space="0" w:color="auto"/>
-          <w:bottom w:val="single" w:sz="4" w:space="0" w:color="auto"/>
-          <w:right w:val="single" w:sz="4" w:space="0" w:color="auto"/>
-          <w:insideH w:val="single" w:sz="4" w:space="0" w:color="auto"/>
-          <w:insideV w:val="single" w:sz="4" w:space="0" w:color="auto"/>
-        </w:tblBorders>
-        <w:tblCellMar>
-          <w:left w:w="10" w:type="dxa"/>
-          <w:right w:w="10" w:type="dxa"/>
-        </w:tblCellMar>
-        <w:tblLook w:val="0000" w:firstRow="0" w:lastRow="0" w:firstColumn="0" w:lastColumn="0" w:noHBand="0" w:noVBand="0"/>
-      </w:tblPr>
-      <w:tblGrid>
-        <w:gridCol w:w="9020"/>
-      </w:tblGrid>
-      <w:tr>
-        <w:tblPrEx>
-          <w:tblCellMar>
-            <w:top w:w="0" w:type="dxa"/>
-            <w:bottom w:w="0" w:type="dxa"/>
-          </w:tblCellMar>
-        </w:tblPrEx>
-        <w:tc>
-          <w:tcPr>
-            <w:tcW w:w="5000" w:type="pct"/>
-            <w:tcBorders>
-              <w:top w:val="dashed" w:sz="2" w:space="0" w:color="9CA3AF"/>
-              <w:left w:val="dashed" w:sz="2" w:space="0" w:color="9CA3AF"/>
-              <w:bottom w:val="dashed" w:sz="2" w:space="0" w:color="9CA3AF"/>
-              <w:right w:val="dashed" w:sz="2" w:space="0" w:color="9CA3AF"/>
-            </w:tcBorders>
-            <w:shd w:val="clear" w:color="auto" w:fill="F9FAFB"/>
-            <w:tcMar>
-              <w:top w:w="300" w:type="dxa"/>
-              <w:left w:w="200" w:type="dxa"/>
-              <w:bottom w:w="300" w:type="dxa"/>
-              <w:right w:w="200" w:type="dxa"/>
-            </w:tcMar>
-          </w:tcPr>
-          <w:p>
-            <w:pPr>
-              <w:jc w:val="center"/>
-            </w:pPr>
-            <w:r>
-              <w:rPr>
-                <w:b/>
-                <w:bCs/>
-                <w:color w:val="4B5563"/>
-              </w:rPr>
-              <w:t>📸 [DÁN ẢNH CHỤP MÀN HÌNH TẠI ĐÂY]</w:t>
-            </w:r>
-          </w:p>
-          <w:p>
-            <w:pPr>
-              <w:spacing w:before="80"/>
-              <w:jc w:val="center"/>
-            </w:pPr>
-            <w:r>
-              <w:rPr>
-                <w:i/>
-                <w:iCs/>
-                <w:color w:val="6B7280"/>
-                <w:sz w:val="18"/>
-                <w:szCs w:val="18"/>
-              </w:rPr>
-              <w:t>Chụp màn hình trang Firebase Console -&gt; Cloud Firestore -&gt; Tab Data -&gt; collection "tasks" với các document mẫu</w:t>
-            </w:r>
-          </w:p>
-        </w:tc>
-      </w:tr>
-    </w:tbl>
     <w:p>
       <w:pPr>
         <w:spacing w:before="100" w:after="200"/>
@@ -1704,98 +1655,128 @@
           <w:sz w:val="19"/>
           <w:szCs w:val="19"/>
         </w:rPr>
+        <w:drawing>
+          <wp:inline distT="0" distB="0" distL="0" distR="0" wp14:anchorId="156A1057" wp14:editId="697266FA">
+            <wp:extent cx="5731510" cy="3323590"/>
+            <wp:effectExtent l="0" t="0" r="2540" b="0"/>
+            <wp:docPr id="1527074540" name="Picture 1"/>
+            <wp:cNvGraphicFramePr>
+              <a:graphicFrameLocks xmlns:a="http://schemas.openxmlformats.org/drawingml/2006/main" noChangeAspect="1"/>
+            </wp:cNvGraphicFramePr>
+            <a:graphic xmlns:a="http://schemas.openxmlformats.org/drawingml/2006/main">
+              <a:graphicData uri="http://schemas.openxmlformats.org/drawingml/2006/picture">
+                <pic:pic xmlns:pic="http://schemas.openxmlformats.org/drawingml/2006/picture">
+                  <pic:nvPicPr>
+                    <pic:cNvPr id="1527074540" name=""/>
+                    <pic:cNvPicPr/>
+                  </pic:nvPicPr>
+                  <pic:blipFill>
+                    <a:blip r:embed="rId6"/>
+                    <a:stretch>
+                      <a:fillRect/>
+                    </a:stretch>
+                  </pic:blipFill>
+                  <pic:spPr>
+                    <a:xfrm>
+                      <a:off x="0" y="0"/>
+                      <a:ext cx="5731510" cy="3323590"/>
+                    </a:xfrm>
+                    <a:prstGeom prst="rect">
+                      <a:avLst/>
+                    </a:prstGeom>
+                  </pic:spPr>
+                </pic:pic>
+              </a:graphicData>
+            </a:graphic>
+          </wp:inline>
+        </w:drawing>
+      </w:r>
+      <w:r>
+        <w:rPr>
+          <w:b/>
+          <w:bCs/>
+          <w:i/>
+          <w:iCs/>
+          <w:color w:val="374151"/>
+          <w:sz w:val="19"/>
+          <w:szCs w:val="19"/>
+        </w:rPr>
         <w:t>Hình 1: Minh chứng cấu hình collection "tasks" trên Firebase Console với các document mẫu chứa đầy đủ các trường dữ liệu.</w:t>
       </w:r>
     </w:p>
     <w:p>
       <w:pPr>
         <w:spacing w:before="240" w:after="80"/>
-      </w:pPr>
-      <w:r>
         <w:rPr>
           <w:b/>
           <w:bCs/>
           <w:color w:val="1E3A8A"/>
         </w:rPr>
+      </w:pPr>
+      <w:r>
+        <w:rPr>
+          <w:b/>
+          <w:bCs/>
+          <w:color w:val="1E3A8A"/>
+        </w:rPr>
         <w:t>3.2. Ảnh 2: Giao diện Home Screen tổng quan</w:t>
       </w:r>
     </w:p>
-    <w:tbl>
-      <w:tblPr>
-        <w:tblW w:w="5000" w:type="pct"/>
-        <w:tblBorders>
-          <w:top w:val="single" w:sz="4" w:space="0" w:color="auto"/>
-          <w:left w:val="single" w:sz="4" w:space="0" w:color="auto"/>
-          <w:bottom w:val="single" w:sz="4" w:space="0" w:color="auto"/>
-          <w:right w:val="single" w:sz="4" w:space="0" w:color="auto"/>
-          <w:insideH w:val="single" w:sz="4" w:space="0" w:color="auto"/>
-          <w:insideV w:val="single" w:sz="4" w:space="0" w:color="auto"/>
-        </w:tblBorders>
-        <w:tblCellMar>
-          <w:left w:w="10" w:type="dxa"/>
-          <w:right w:w="10" w:type="dxa"/>
-        </w:tblCellMar>
-        <w:tblLook w:val="0000" w:firstRow="0" w:lastRow="0" w:firstColumn="0" w:lastColumn="0" w:noHBand="0" w:noVBand="0"/>
-      </w:tblPr>
-      <w:tblGrid>
-        <w:gridCol w:w="9020"/>
-      </w:tblGrid>
-      <w:tr>
-        <w:tblPrEx>
-          <w:tblCellMar>
-            <w:top w:w="0" w:type="dxa"/>
-            <w:bottom w:w="0" w:type="dxa"/>
-          </w:tblCellMar>
-        </w:tblPrEx>
-        <w:tc>
-          <w:tcPr>
-            <w:tcW w:w="5000" w:type="pct"/>
-            <w:tcBorders>
-              <w:top w:val="dashed" w:sz="2" w:space="0" w:color="9CA3AF"/>
-              <w:left w:val="dashed" w:sz="2" w:space="0" w:color="9CA3AF"/>
-              <w:bottom w:val="dashed" w:sz="2" w:space="0" w:color="9CA3AF"/>
-              <w:right w:val="dashed" w:sz="2" w:space="0" w:color="9CA3AF"/>
-            </w:tcBorders>
-            <w:shd w:val="clear" w:color="auto" w:fill="F9FAFB"/>
-            <w:tcMar>
-              <w:top w:w="300" w:type="dxa"/>
-              <w:left w:w="200" w:type="dxa"/>
-              <w:bottom w:w="300" w:type="dxa"/>
-              <w:right w:w="200" w:type="dxa"/>
-            </w:tcMar>
-          </w:tcPr>
-          <w:p>
-            <w:pPr>
-              <w:jc w:val="center"/>
-            </w:pPr>
-            <w:r>
-              <w:rPr>
-                <w:b/>
-                <w:bCs/>
-                <w:color w:val="4B5563"/>
-              </w:rPr>
-              <w:t>📸 [DÁN ẢNH CHỤP MÀN HÌNH TẠI ĐÂY]</w:t>
-            </w:r>
-          </w:p>
-          <w:p>
-            <w:pPr>
-              <w:spacing w:before="80"/>
-              <w:jc w:val="center"/>
-            </w:pPr>
-            <w:r>
-              <w:rPr>
-                <w:i/>
-                <w:iCs/>
-                <w:color w:val="6B7280"/>
-                <w:sz w:val="18"/>
-                <w:szCs w:val="18"/>
-              </w:rPr>
-              <w:t>Chụp toàn màn hình Home Screen khi mở app (có Header, thẻ thống kê Bento, nút lọc trạng thái và thanh Bottom Tabs)</w:t>
-            </w:r>
-          </w:p>
-        </w:tc>
-      </w:tr>
-    </w:tbl>
+    <w:p>
+      <w:pPr>
+        <w:spacing w:before="240" w:after="80"/>
+        <w:jc w:val="center"/>
+      </w:pPr>
+      <w:r>
+        <w:rPr>
+          <w:color w:val="374151"/>
+          <w:sz w:val="19"/>
+          <w:szCs w:val="19"/>
+        </w:rPr>
+        <w:lastRenderedPageBreak/>
+        <w:drawing>
+          <wp:inline distT="0" distB="0" distL="0" distR="0" wp14:anchorId="48E16878" wp14:editId="5F87C7EE">
+            <wp:extent cx="1866900" cy="4148728"/>
+            <wp:effectExtent l="0" t="0" r="0" b="4445"/>
+            <wp:docPr id="1334023032" name="Picture 1"/>
+            <wp:cNvGraphicFramePr>
+              <a:graphicFrameLocks xmlns:a="http://schemas.openxmlformats.org/drawingml/2006/main" noChangeAspect="1"/>
+            </wp:cNvGraphicFramePr>
+            <a:graphic xmlns:a="http://schemas.openxmlformats.org/drawingml/2006/main">
+              <a:graphicData uri="http://schemas.openxmlformats.org/drawingml/2006/picture">
+                <pic:pic xmlns:pic="http://schemas.openxmlformats.org/drawingml/2006/picture">
+                  <pic:nvPicPr>
+                    <pic:cNvPr id="1334023032" name=""/>
+                    <pic:cNvPicPr/>
+                  </pic:nvPicPr>
+                  <pic:blipFill>
+                    <a:blip r:embed="rId7"/>
+                    <a:stretch>
+                      <a:fillRect/>
+                    </a:stretch>
+                  </pic:blipFill>
+                  <pic:spPr>
+                    <a:xfrm>
+                      <a:off x="0" y="0"/>
+                      <a:ext cx="1879115" cy="4175874"/>
+                    </a:xfrm>
+                    <a:prstGeom prst="rect">
+                      <a:avLst/>
+                    </a:prstGeom>
+                  </pic:spPr>
+                </pic:pic>
+              </a:graphicData>
+            </a:graphic>
+          </wp:inline>
+        </w:drawing>
+      </w:r>
+    </w:p>
+    <w:p>
+      <w:pPr>
+        <w:spacing w:before="240" w:after="80"/>
+        <w:jc w:val="center"/>
+      </w:pPr>
+    </w:p>
     <w:p>
       <w:pPr>
         <w:spacing w:before="100" w:after="200"/>
@@ -1827,88 +1808,64 @@
         <w:t>3.3. Ảnh 3: Form tạo Task (Create Task Modal) đang điền thông tin</w:t>
       </w:r>
     </w:p>
-    <w:tbl>
-      <w:tblPr>
-        <w:tblW w:w="5000" w:type="pct"/>
-        <w:tblBorders>
-          <w:top w:val="single" w:sz="4" w:space="0" w:color="auto"/>
-          <w:left w:val="single" w:sz="4" w:space="0" w:color="auto"/>
-          <w:bottom w:val="single" w:sz="4" w:space="0" w:color="auto"/>
-          <w:right w:val="single" w:sz="4" w:space="0" w:color="auto"/>
-          <w:insideH w:val="single" w:sz="4" w:space="0" w:color="auto"/>
-          <w:insideV w:val="single" w:sz="4" w:space="0" w:color="auto"/>
-        </w:tblBorders>
-        <w:tblCellMar>
-          <w:left w:w="10" w:type="dxa"/>
-          <w:right w:w="10" w:type="dxa"/>
-        </w:tblCellMar>
-        <w:tblLook w:val="0000" w:firstRow="0" w:lastRow="0" w:firstColumn="0" w:lastColumn="0" w:noHBand="0" w:noVBand="0"/>
-      </w:tblPr>
-      <w:tblGrid>
-        <w:gridCol w:w="9020"/>
-      </w:tblGrid>
-      <w:tr>
-        <w:tblPrEx>
-          <w:tblCellMar>
-            <w:top w:w="0" w:type="dxa"/>
-            <w:bottom w:w="0" w:type="dxa"/>
-          </w:tblCellMar>
-        </w:tblPrEx>
-        <w:tc>
-          <w:tcPr>
-            <w:tcW w:w="5000" w:type="pct"/>
-            <w:tcBorders>
-              <w:top w:val="dashed" w:sz="2" w:space="0" w:color="9CA3AF"/>
-              <w:left w:val="dashed" w:sz="2" w:space="0" w:color="9CA3AF"/>
-              <w:bottom w:val="dashed" w:sz="2" w:space="0" w:color="9CA3AF"/>
-              <w:right w:val="dashed" w:sz="2" w:space="0" w:color="9CA3AF"/>
-            </w:tcBorders>
-            <w:shd w:val="clear" w:color="auto" w:fill="F9FAFB"/>
-            <w:tcMar>
-              <w:top w:w="300" w:type="dxa"/>
-              <w:left w:w="200" w:type="dxa"/>
-              <w:bottom w:w="300" w:type="dxa"/>
-              <w:right w:w="200" w:type="dxa"/>
-            </w:tcMar>
-          </w:tcPr>
-          <w:p>
-            <w:pPr>
-              <w:jc w:val="center"/>
-            </w:pPr>
-            <w:r>
-              <w:rPr>
-                <w:b/>
-                <w:bCs/>
-                <w:color w:val="4B5563"/>
-              </w:rPr>
-              <w:t>📸 [DÁN ẢNH CHỤP MÀN HÌNH TẠI ĐÂY]</w:t>
-            </w:r>
-          </w:p>
-          <w:p>
-            <w:pPr>
-              <w:spacing w:before="80"/>
-              <w:jc w:val="center"/>
-            </w:pPr>
-            <w:r>
-              <w:rPr>
-                <w:i/>
-                <w:iCs/>
-                <w:color w:val="6B7280"/>
-                <w:sz w:val="18"/>
-                <w:szCs w:val="18"/>
-              </w:rPr>
-              <w:t>Chụp khi bấm nút "Tạo mới", form modal hiện lên với các trường Tiêu đề, Ghi chú, Trạng thái, Độ ưu tiên và chọn Hạn hoàn thành</w:t>
-            </w:r>
-          </w:p>
-        </w:tc>
-      </w:tr>
-    </w:tbl>
     <w:p>
       <w:pPr>
         <w:spacing w:before="100" w:after="200"/>
         <w:jc w:val="center"/>
-      </w:pPr>
-      <w:r>
+        <w:rPr>
+          <w:color w:val="374151"/>
+          <w:sz w:val="19"/>
+          <w:szCs w:val="19"/>
+        </w:rPr>
+      </w:pPr>
+      <w:r>
+        <w:rPr>
+          <w:color w:val="374151"/>
+          <w:sz w:val="19"/>
+          <w:szCs w:val="19"/>
+        </w:rPr>
+        <w:lastRenderedPageBreak/>
+        <w:drawing>
+          <wp:inline distT="0" distB="0" distL="0" distR="0" wp14:anchorId="31F91615" wp14:editId="7E2568F8">
+            <wp:extent cx="1974501" cy="4387850"/>
+            <wp:effectExtent l="0" t="0" r="6985" b="0"/>
+            <wp:docPr id="1602426189" name="Picture 1"/>
+            <wp:cNvGraphicFramePr>
+              <a:graphicFrameLocks xmlns:a="http://schemas.openxmlformats.org/drawingml/2006/main" noChangeAspect="1"/>
+            </wp:cNvGraphicFramePr>
+            <a:graphic xmlns:a="http://schemas.openxmlformats.org/drawingml/2006/main">
+              <a:graphicData uri="http://schemas.openxmlformats.org/drawingml/2006/picture">
+                <pic:pic xmlns:pic="http://schemas.openxmlformats.org/drawingml/2006/picture">
+                  <pic:nvPicPr>
+                    <pic:cNvPr id="1602426189" name=""/>
+                    <pic:cNvPicPr/>
+                  </pic:nvPicPr>
+                  <pic:blipFill>
+                    <a:blip r:embed="rId8"/>
+                    <a:stretch>
+                      <a:fillRect/>
+                    </a:stretch>
+                  </pic:blipFill>
+                  <pic:spPr>
+                    <a:xfrm>
+                      <a:off x="0" y="0"/>
+                      <a:ext cx="1977130" cy="4393693"/>
+                    </a:xfrm>
+                    <a:prstGeom prst="rect">
+                      <a:avLst/>
+                    </a:prstGeom>
+                  </pic:spPr>
+                </pic:pic>
+              </a:graphicData>
+            </a:graphic>
+          </wp:inline>
+        </w:drawing>
+      </w:r>
+    </w:p>
+    <w:p>
+      <w:pPr>
+        <w:spacing w:before="100" w:after="200"/>
+        <w:jc w:val="center"/>
         <w:rPr>
           <w:b/>
           <w:bCs/>
@@ -1918,98 +1875,8 @@
           <w:sz w:val="19"/>
           <w:szCs w:val="19"/>
         </w:rPr>
-        <w:t>Hình 3: Modal "Tạo Công Việc Mới" với đầy đủ các trường thông tin trước khi nhấn nút "Tạo nhiệm vụ".</w:t>
-      </w:r>
-    </w:p>
-    <w:p>
-      <w:pPr>
-        <w:spacing w:before="240" w:after="80"/>
-      </w:pPr>
-      <w:r>
-        <w:rPr>
-          <w:b/>
-          <w:bCs/>
-          <w:color w:val="1E3A8A"/>
-        </w:rPr>
-        <w:t>3.4. Ảnh 4: Danh sách Task sau khi tạo thành công</w:t>
-      </w:r>
-    </w:p>
-    <w:tbl>
-      <w:tblPr>
-        <w:tblW w:w="5000" w:type="pct"/>
-        <w:tblBorders>
-          <w:top w:val="single" w:sz="4" w:space="0" w:color="auto"/>
-          <w:left w:val="single" w:sz="4" w:space="0" w:color="auto"/>
-          <w:bottom w:val="single" w:sz="4" w:space="0" w:color="auto"/>
-          <w:right w:val="single" w:sz="4" w:space="0" w:color="auto"/>
-          <w:insideH w:val="single" w:sz="4" w:space="0" w:color="auto"/>
-          <w:insideV w:val="single" w:sz="4" w:space="0" w:color="auto"/>
-        </w:tblBorders>
-        <w:tblCellMar>
-          <w:left w:w="10" w:type="dxa"/>
-          <w:right w:w="10" w:type="dxa"/>
-        </w:tblCellMar>
-        <w:tblLook w:val="0000" w:firstRow="0" w:lastRow="0" w:firstColumn="0" w:lastColumn="0" w:noHBand="0" w:noVBand="0"/>
-      </w:tblPr>
-      <w:tblGrid>
-        <w:gridCol w:w="9020"/>
-      </w:tblGrid>
-      <w:tr>
-        <w:tblPrEx>
-          <w:tblCellMar>
-            <w:top w:w="0" w:type="dxa"/>
-            <w:bottom w:w="0" w:type="dxa"/>
-          </w:tblCellMar>
-        </w:tblPrEx>
-        <w:tc>
-          <w:tcPr>
-            <w:tcW w:w="5000" w:type="pct"/>
-            <w:tcBorders>
-              <w:top w:val="dashed" w:sz="2" w:space="0" w:color="9CA3AF"/>
-              <w:left w:val="dashed" w:sz="2" w:space="0" w:color="9CA3AF"/>
-              <w:bottom w:val="dashed" w:sz="2" w:space="0" w:color="9CA3AF"/>
-              <w:right w:val="dashed" w:sz="2" w:space="0" w:color="9CA3AF"/>
-            </w:tcBorders>
-            <w:shd w:val="clear" w:color="auto" w:fill="F9FAFB"/>
-            <w:tcMar>
-              <w:top w:w="300" w:type="dxa"/>
-              <w:left w:w="200" w:type="dxa"/>
-              <w:bottom w:w="300" w:type="dxa"/>
-              <w:right w:w="200" w:type="dxa"/>
-            </w:tcMar>
-          </w:tcPr>
-          <w:p>
-            <w:pPr>
-              <w:jc w:val="center"/>
-            </w:pPr>
-            <w:r>
-              <w:rPr>
-                <w:b/>
-                <w:bCs/>
-                <w:color w:val="4B5563"/>
-              </w:rPr>
-              <w:t>📸 [DÁN ẢNH CHỤP MÀN HÌNH TẠI ĐÂY]</w:t>
-            </w:r>
-          </w:p>
-          <w:p>
-            <w:pPr>
-              <w:spacing w:before="80"/>
-              <w:jc w:val="center"/>
-            </w:pPr>
-            <w:r>
-              <w:rPr>
-                <w:i/>
-                <w:iCs/>
-                <w:color w:val="6B7280"/>
-                <w:sz w:val="18"/>
-                <w:szCs w:val="18"/>
-              </w:rPr>
-              <w:t>Chụp danh sách Task hiển thị công việc mới vừa tạo xuất hiện trên đầu danh sách</w:t>
-            </w:r>
-          </w:p>
-        </w:tc>
-      </w:tr>
-    </w:tbl>
+      </w:pPr>
+    </w:p>
     <w:p>
       <w:pPr>
         <w:spacing w:before="100" w:after="200"/>
@@ -2025,7 +1892,7 @@
           <w:sz w:val="19"/>
           <w:szCs w:val="19"/>
         </w:rPr>
-        <w:t>Hình 4: Công việc mới được tạo thành công và tự động hiển thị ngay lập tức trên màn hình nhờ Firestore Real-time listener.</w:t>
+        <w:t>Hình 3: Modal "Tạo Công Việc Mới" với đầy đủ các trường thông tin trước khi nhấn nút "Tạo nhiệm vụ".</w:t>
       </w:r>
     </w:p>
     <w:p>
@@ -2038,89 +1905,78 @@
           <w:bCs/>
           <w:color w:val="1E3A8A"/>
         </w:rPr>
-        <w:t>3.5. Ảnh 5: Form chỉnh sửa Task (Edit Task Modal)</w:t>
-      </w:r>
-    </w:p>
-    <w:tbl>
-      <w:tblPr>
-        <w:tblW w:w="5000" w:type="pct"/>
-        <w:tblBorders>
-          <w:top w:val="single" w:sz="4" w:space="0" w:color="auto"/>
-          <w:left w:val="single" w:sz="4" w:space="0" w:color="auto"/>
-          <w:bottom w:val="single" w:sz="4" w:space="0" w:color="auto"/>
-          <w:right w:val="single" w:sz="4" w:space="0" w:color="auto"/>
-          <w:insideH w:val="single" w:sz="4" w:space="0" w:color="auto"/>
-          <w:insideV w:val="single" w:sz="4" w:space="0" w:color="auto"/>
-        </w:tblBorders>
-        <w:tblCellMar>
-          <w:left w:w="10" w:type="dxa"/>
-          <w:right w:w="10" w:type="dxa"/>
-        </w:tblCellMar>
-        <w:tblLook w:val="0000" w:firstRow="0" w:lastRow="0" w:firstColumn="0" w:lastColumn="0" w:noHBand="0" w:noVBand="0"/>
-      </w:tblPr>
-      <w:tblGrid>
-        <w:gridCol w:w="9020"/>
-      </w:tblGrid>
-      <w:tr>
-        <w:tblPrEx>
-          <w:tblCellMar>
-            <w:top w:w="0" w:type="dxa"/>
-            <w:bottom w:w="0" w:type="dxa"/>
-          </w:tblCellMar>
-        </w:tblPrEx>
-        <w:tc>
-          <w:tcPr>
-            <w:tcW w:w="5000" w:type="pct"/>
-            <w:tcBorders>
-              <w:top w:val="dashed" w:sz="2" w:space="0" w:color="9CA3AF"/>
-              <w:left w:val="dashed" w:sz="2" w:space="0" w:color="9CA3AF"/>
-              <w:bottom w:val="dashed" w:sz="2" w:space="0" w:color="9CA3AF"/>
-              <w:right w:val="dashed" w:sz="2" w:space="0" w:color="9CA3AF"/>
-            </w:tcBorders>
-            <w:shd w:val="clear" w:color="auto" w:fill="F9FAFB"/>
-            <w:tcMar>
-              <w:top w:w="300" w:type="dxa"/>
-              <w:left w:w="200" w:type="dxa"/>
-              <w:bottom w:w="300" w:type="dxa"/>
-              <w:right w:w="200" w:type="dxa"/>
-            </w:tcMar>
-          </w:tcPr>
-          <w:p>
-            <w:pPr>
-              <w:jc w:val="center"/>
-            </w:pPr>
-            <w:r>
-              <w:rPr>
-                <w:b/>
-                <w:bCs/>
-                <w:color w:val="4B5563"/>
-              </w:rPr>
-              <w:t>📸 [DÁN ẢNH CHỤP MÀN HÌNH TẠI ĐÂY]</w:t>
-            </w:r>
-          </w:p>
-          <w:p>
-            <w:pPr>
-              <w:spacing w:before="80"/>
-              <w:jc w:val="center"/>
-            </w:pPr>
-            <w:r>
-              <w:rPr>
-                <w:i/>
-                <w:iCs/>
-                <w:color w:val="6B7280"/>
-                <w:sz w:val="18"/>
-                <w:szCs w:val="18"/>
-              </w:rPr>
-              <w:t>Chụp khi nhấn icon cây bút trên một Task card, modal hiện lên với dữ liệu cũ được điền sẵn</w:t>
-            </w:r>
-          </w:p>
-        </w:tc>
-      </w:tr>
-    </w:tbl>
+        <w:t>3.4. Ảnh 4: Danh sách Task sau khi tạo thành công</w:t>
+      </w:r>
+    </w:p>
     <w:p>
       <w:pPr>
         <w:spacing w:before="100" w:after="200"/>
         <w:jc w:val="center"/>
+        <w:rPr>
+          <w:color w:val="374151"/>
+          <w:sz w:val="19"/>
+          <w:szCs w:val="19"/>
+        </w:rPr>
+      </w:pPr>
+      <w:r>
+        <w:rPr>
+          <w:color w:val="374151"/>
+          <w:sz w:val="19"/>
+          <w:szCs w:val="19"/>
+        </w:rPr>
+        <w:lastRenderedPageBreak/>
+        <w:drawing>
+          <wp:inline distT="0" distB="0" distL="0" distR="0" wp14:anchorId="22B57A80" wp14:editId="3F103E70">
+            <wp:extent cx="2042160" cy="4538206"/>
+            <wp:effectExtent l="0" t="0" r="0" b="0"/>
+            <wp:docPr id="656019078" name="Picture 1"/>
+            <wp:cNvGraphicFramePr>
+              <a:graphicFrameLocks xmlns:a="http://schemas.openxmlformats.org/drawingml/2006/main" noChangeAspect="1"/>
+            </wp:cNvGraphicFramePr>
+            <a:graphic xmlns:a="http://schemas.openxmlformats.org/drawingml/2006/main">
+              <a:graphicData uri="http://schemas.openxmlformats.org/drawingml/2006/picture">
+                <pic:pic xmlns:pic="http://schemas.openxmlformats.org/drawingml/2006/picture">
+                  <pic:nvPicPr>
+                    <pic:cNvPr id="656019078" name=""/>
+                    <pic:cNvPicPr/>
+                  </pic:nvPicPr>
+                  <pic:blipFill>
+                    <a:blip r:embed="rId9"/>
+                    <a:stretch>
+                      <a:fillRect/>
+                    </a:stretch>
+                  </pic:blipFill>
+                  <pic:spPr>
+                    <a:xfrm>
+                      <a:off x="0" y="0"/>
+                      <a:ext cx="2046004" cy="4546749"/>
+                    </a:xfrm>
+                    <a:prstGeom prst="rect">
+                      <a:avLst/>
+                    </a:prstGeom>
+                  </pic:spPr>
+                </pic:pic>
+              </a:graphicData>
+            </a:graphic>
+          </wp:inline>
+        </w:drawing>
+      </w:r>
+    </w:p>
+    <w:p>
+      <w:pPr>
+        <w:spacing w:before="100" w:after="200"/>
+        <w:jc w:val="center"/>
+        <w:rPr>
+          <w:color w:val="374151"/>
+          <w:sz w:val="19"/>
+          <w:szCs w:val="19"/>
+        </w:rPr>
+      </w:pPr>
+    </w:p>
+    <w:p>
+      <w:pPr>
+        <w:spacing w:before="100" w:after="200"/>
+        <w:jc w:val="center"/>
       </w:pPr>
       <w:r>
         <w:rPr>
@@ -2132,7 +1988,7 @@
           <w:sz w:val="19"/>
           <w:szCs w:val="19"/>
         </w:rPr>
-        <w:t>Hình 5: Modal "Chỉnh Sửa Công Việc" với dữ liệu task cũ được nạp sẵn, cho phép cập nhật tiêu đề, mô tả, mức độ ưu tiên hoặc trạng thái.</w:t>
+        <w:t>Hình 4: Công việc mới được tạo thành công và tự động hiển thị ngay lập tức trên màn hình nhờ Firestore Real-time listener.</w:t>
       </w:r>
     </w:p>
     <w:p>
@@ -2145,90 +2001,67 @@
           <w:bCs/>
           <w:color w:val="1E3A8A"/>
         </w:rPr>
-        <w:t>3.6. Ảnh 6: Danh sách Task sau khi chỉnh sửa thành công</w:t>
-      </w:r>
-    </w:p>
-    <w:tbl>
-      <w:tblPr>
-        <w:tblW w:w="5000" w:type="pct"/>
-        <w:tblBorders>
-          <w:top w:val="single" w:sz="4" w:space="0" w:color="auto"/>
-          <w:left w:val="single" w:sz="4" w:space="0" w:color="auto"/>
-          <w:bottom w:val="single" w:sz="4" w:space="0" w:color="auto"/>
-          <w:right w:val="single" w:sz="4" w:space="0" w:color="auto"/>
-          <w:insideH w:val="single" w:sz="4" w:space="0" w:color="auto"/>
-          <w:insideV w:val="single" w:sz="4" w:space="0" w:color="auto"/>
-        </w:tblBorders>
-        <w:tblCellMar>
-          <w:left w:w="10" w:type="dxa"/>
-          <w:right w:w="10" w:type="dxa"/>
-        </w:tblCellMar>
-        <w:tblLook w:val="0000" w:firstRow="0" w:lastRow="0" w:firstColumn="0" w:lastColumn="0" w:noHBand="0" w:noVBand="0"/>
-      </w:tblPr>
-      <w:tblGrid>
-        <w:gridCol w:w="9020"/>
-      </w:tblGrid>
-      <w:tr>
-        <w:tblPrEx>
-          <w:tblCellMar>
-            <w:top w:w="0" w:type="dxa"/>
-            <w:bottom w:w="0" w:type="dxa"/>
-          </w:tblCellMar>
-        </w:tblPrEx>
-        <w:tc>
-          <w:tcPr>
-            <w:tcW w:w="5000" w:type="pct"/>
-            <w:tcBorders>
-              <w:top w:val="dashed" w:sz="2" w:space="0" w:color="9CA3AF"/>
-              <w:left w:val="dashed" w:sz="2" w:space="0" w:color="9CA3AF"/>
-              <w:bottom w:val="dashed" w:sz="2" w:space="0" w:color="9CA3AF"/>
-              <w:right w:val="dashed" w:sz="2" w:space="0" w:color="9CA3AF"/>
-            </w:tcBorders>
-            <w:shd w:val="clear" w:color="auto" w:fill="F9FAFB"/>
-            <w:tcMar>
-              <w:top w:w="300" w:type="dxa"/>
-              <w:left w:w="200" w:type="dxa"/>
-              <w:bottom w:w="300" w:type="dxa"/>
-              <w:right w:w="200" w:type="dxa"/>
-            </w:tcMar>
-          </w:tcPr>
-          <w:p>
-            <w:pPr>
-              <w:jc w:val="center"/>
-            </w:pPr>
-            <w:r>
-              <w:rPr>
-                <w:b/>
-                <w:bCs/>
-                <w:color w:val="4B5563"/>
-              </w:rPr>
-              <w:lastRenderedPageBreak/>
-              <w:t>📸 [DÁN ẢNH CHỤP MÀN HÌNH TẠI ĐÂY]</w:t>
-            </w:r>
-          </w:p>
-          <w:p>
-            <w:pPr>
-              <w:spacing w:before="80"/>
-              <w:jc w:val="center"/>
-            </w:pPr>
-            <w:r>
-              <w:rPr>
-                <w:i/>
-                <w:iCs/>
-                <w:color w:val="6B7280"/>
-                <w:sz w:val="18"/>
-                <w:szCs w:val="18"/>
-              </w:rPr>
-              <w:t>Chụp danh sách Task hiển thị nội dung mới của công việc đã sửa</w:t>
-            </w:r>
-          </w:p>
-        </w:tc>
-      </w:tr>
-    </w:tbl>
+        <w:t>3.5. Ảnh 5: Form chỉnh sửa Task (Edit Task Modal)</w:t>
+      </w:r>
+    </w:p>
     <w:p>
       <w:pPr>
         <w:spacing w:before="100" w:after="200"/>
         <w:jc w:val="center"/>
+        <w:rPr>
+          <w:color w:val="374151"/>
+          <w:sz w:val="19"/>
+          <w:szCs w:val="19"/>
+        </w:rPr>
+      </w:pPr>
+      <w:r>
+        <w:rPr>
+          <w:color w:val="374151"/>
+          <w:sz w:val="19"/>
+          <w:szCs w:val="19"/>
+        </w:rPr>
+        <w:lastRenderedPageBreak/>
+        <w:drawing>
+          <wp:inline distT="0" distB="0" distL="0" distR="0" wp14:anchorId="4555132D" wp14:editId="7F3E5CAA">
+            <wp:extent cx="1898650" cy="4219289"/>
+            <wp:effectExtent l="0" t="0" r="6350" b="0"/>
+            <wp:docPr id="2103502462" name="Picture 1"/>
+            <wp:cNvGraphicFramePr>
+              <a:graphicFrameLocks xmlns:a="http://schemas.openxmlformats.org/drawingml/2006/main" noChangeAspect="1"/>
+            </wp:cNvGraphicFramePr>
+            <a:graphic xmlns:a="http://schemas.openxmlformats.org/drawingml/2006/main">
+              <a:graphicData uri="http://schemas.openxmlformats.org/drawingml/2006/picture">
+                <pic:pic xmlns:pic="http://schemas.openxmlformats.org/drawingml/2006/picture">
+                  <pic:nvPicPr>
+                    <pic:cNvPr id="2103502462" name=""/>
+                    <pic:cNvPicPr/>
+                  </pic:nvPicPr>
+                  <pic:blipFill>
+                    <a:blip r:embed="rId10"/>
+                    <a:stretch>
+                      <a:fillRect/>
+                    </a:stretch>
+                  </pic:blipFill>
+                  <pic:spPr>
+                    <a:xfrm>
+                      <a:off x="0" y="0"/>
+                      <a:ext cx="1904308" cy="4231862"/>
+                    </a:xfrm>
+                    <a:prstGeom prst="rect">
+                      <a:avLst/>
+                    </a:prstGeom>
+                  </pic:spPr>
+                </pic:pic>
+              </a:graphicData>
+            </a:graphic>
+          </wp:inline>
+        </w:drawing>
+      </w:r>
+    </w:p>
+    <w:p>
+      <w:pPr>
+        <w:spacing w:before="100" w:after="200"/>
+        <w:jc w:val="center"/>
       </w:pPr>
       <w:r>
         <w:rPr>
@@ -2240,7 +2073,7 @@
           <w:sz w:val="19"/>
           <w:szCs w:val="19"/>
         </w:rPr>
-        <w:t>Hình 6: Công việc sau khi được cập nhật thành công, thông tin thay đổi được phản ánh tức thì trên danh sách.</w:t>
+        <w:t>Hình 5: Modal "Chỉnh Sửa Công Việc" với dữ liệu task cũ được nạp sẵn, cho phép cập nhật tiêu đề, mô tả, mức độ ưu tiên hoặc trạng thái.</w:t>
       </w:r>
     </w:p>
     <w:p>
@@ -2253,89 +2086,67 @@
           <w:bCs/>
           <w:color w:val="1E3A8A"/>
         </w:rPr>
-        <w:t>3.7. Ảnh 7: Chức năng Xóa công việc (Delete Task)</w:t>
-      </w:r>
-    </w:p>
-    <w:tbl>
-      <w:tblPr>
-        <w:tblW w:w="5000" w:type="pct"/>
-        <w:tblBorders>
-          <w:top w:val="single" w:sz="4" w:space="0" w:color="auto"/>
-          <w:left w:val="single" w:sz="4" w:space="0" w:color="auto"/>
-          <w:bottom w:val="single" w:sz="4" w:space="0" w:color="auto"/>
-          <w:right w:val="single" w:sz="4" w:space="0" w:color="auto"/>
-          <w:insideH w:val="single" w:sz="4" w:space="0" w:color="auto"/>
-          <w:insideV w:val="single" w:sz="4" w:space="0" w:color="auto"/>
-        </w:tblBorders>
-        <w:tblCellMar>
-          <w:left w:w="10" w:type="dxa"/>
-          <w:right w:w="10" w:type="dxa"/>
-        </w:tblCellMar>
-        <w:tblLook w:val="0000" w:firstRow="0" w:lastRow="0" w:firstColumn="0" w:lastColumn="0" w:noHBand="0" w:noVBand="0"/>
-      </w:tblPr>
-      <w:tblGrid>
-        <w:gridCol w:w="9020"/>
-      </w:tblGrid>
-      <w:tr>
-        <w:tblPrEx>
-          <w:tblCellMar>
-            <w:top w:w="0" w:type="dxa"/>
-            <w:bottom w:w="0" w:type="dxa"/>
-          </w:tblCellMar>
-        </w:tblPrEx>
-        <w:tc>
-          <w:tcPr>
-            <w:tcW w:w="5000" w:type="pct"/>
-            <w:tcBorders>
-              <w:top w:val="dashed" w:sz="2" w:space="0" w:color="9CA3AF"/>
-              <w:left w:val="dashed" w:sz="2" w:space="0" w:color="9CA3AF"/>
-              <w:bottom w:val="dashed" w:sz="2" w:space="0" w:color="9CA3AF"/>
-              <w:right w:val="dashed" w:sz="2" w:space="0" w:color="9CA3AF"/>
-            </w:tcBorders>
-            <w:shd w:val="clear" w:color="auto" w:fill="F9FAFB"/>
-            <w:tcMar>
-              <w:top w:w="300" w:type="dxa"/>
-              <w:left w:w="200" w:type="dxa"/>
-              <w:bottom w:w="300" w:type="dxa"/>
-              <w:right w:w="200" w:type="dxa"/>
-            </w:tcMar>
-          </w:tcPr>
-          <w:p>
-            <w:pPr>
-              <w:jc w:val="center"/>
-            </w:pPr>
-            <w:r>
-              <w:rPr>
-                <w:b/>
-                <w:bCs/>
-                <w:color w:val="4B5563"/>
-              </w:rPr>
-              <w:t>📸 [DÁN ẢNH CHỤP MÀN HÌNH TẠI ĐÂY]</w:t>
-            </w:r>
-          </w:p>
-          <w:p>
-            <w:pPr>
-              <w:spacing w:before="80"/>
-              <w:jc w:val="center"/>
-            </w:pPr>
-            <w:r>
-              <w:rPr>
-                <w:i/>
-                <w:iCs/>
-                <w:color w:val="6B7280"/>
-                <w:sz w:val="18"/>
-                <w:szCs w:val="18"/>
-              </w:rPr>
-              <w:t>Chụp popup xác nhận xóa "Bạn có chắc muốn xóa..." và danh sách sau khi task đó đã bị xóa khỏi màn hình</w:t>
-            </w:r>
-          </w:p>
-        </w:tc>
-      </w:tr>
-    </w:tbl>
+        <w:t>3.6. Ảnh 6: Danh sách Task sau khi chỉnh sửa thành công</w:t>
+      </w:r>
+    </w:p>
     <w:p>
       <w:pPr>
         <w:spacing w:before="100" w:after="200"/>
         <w:jc w:val="center"/>
+        <w:rPr>
+          <w:color w:val="374151"/>
+          <w:sz w:val="19"/>
+          <w:szCs w:val="19"/>
+        </w:rPr>
+      </w:pPr>
+      <w:r>
+        <w:rPr>
+          <w:color w:val="374151"/>
+          <w:sz w:val="19"/>
+          <w:szCs w:val="19"/>
+        </w:rPr>
+        <w:lastRenderedPageBreak/>
+        <w:drawing>
+          <wp:inline distT="0" distB="0" distL="0" distR="0" wp14:anchorId="0C29BC41" wp14:editId="254A375E">
+            <wp:extent cx="2190750" cy="4868413"/>
+            <wp:effectExtent l="0" t="0" r="0" b="8890"/>
+            <wp:docPr id="829889224" name="Picture 1"/>
+            <wp:cNvGraphicFramePr>
+              <a:graphicFrameLocks xmlns:a="http://schemas.openxmlformats.org/drawingml/2006/main" noChangeAspect="1"/>
+            </wp:cNvGraphicFramePr>
+            <a:graphic xmlns:a="http://schemas.openxmlformats.org/drawingml/2006/main">
+              <a:graphicData uri="http://schemas.openxmlformats.org/drawingml/2006/picture">
+                <pic:pic xmlns:pic="http://schemas.openxmlformats.org/drawingml/2006/picture">
+                  <pic:nvPicPr>
+                    <pic:cNvPr id="829889224" name=""/>
+                    <pic:cNvPicPr/>
+                  </pic:nvPicPr>
+                  <pic:blipFill>
+                    <a:blip r:embed="rId11"/>
+                    <a:stretch>
+                      <a:fillRect/>
+                    </a:stretch>
+                  </pic:blipFill>
+                  <pic:spPr>
+                    <a:xfrm>
+                      <a:off x="0" y="0"/>
+                      <a:ext cx="2194658" cy="4877098"/>
+                    </a:xfrm>
+                    <a:prstGeom prst="rect">
+                      <a:avLst/>
+                    </a:prstGeom>
+                  </pic:spPr>
+                </pic:pic>
+              </a:graphicData>
+            </a:graphic>
+          </wp:inline>
+        </w:drawing>
+      </w:r>
+    </w:p>
+    <w:p>
+      <w:pPr>
+        <w:spacing w:before="100" w:after="200"/>
+        <w:jc w:val="center"/>
       </w:pPr>
       <w:r>
         <w:rPr>
@@ -2347,98 +2158,362 @@
           <w:sz w:val="19"/>
           <w:szCs w:val="19"/>
         </w:rPr>
-        <w:t>Hình 7: Minh chứng chức năng Xóa (Delete): sau khi người dùng xác nhận tại hộp thoại cảnh báo, document tương ứng được xóa khỏi Firestore.</w:t>
+        <w:t>Hình 6: Công việc sau khi được cập nhật thành công, thông tin thay đổi được phản ánh tức thì trên danh sách.</w:t>
       </w:r>
     </w:p>
     <w:p>
       <w:pPr>
         <w:spacing w:before="240" w:after="80"/>
-      </w:pPr>
-      <w:r>
         <w:rPr>
           <w:b/>
           <w:bCs/>
           <w:color w:val="1E3A8A"/>
         </w:rPr>
-        <w:t>3.8. Ảnh 8: Thanh Bottom Navigation &amp; Màn hình "Đội nhóm" (Teams Screen)</w:t>
-      </w:r>
-    </w:p>
-    <w:tbl>
-      <w:tblPr>
-        <w:tblW w:w="5000" w:type="pct"/>
-        <w:tblBorders>
-          <w:top w:val="single" w:sz="4" w:space="0" w:color="auto"/>
-          <w:left w:val="single" w:sz="4" w:space="0" w:color="auto"/>
-          <w:bottom w:val="single" w:sz="4" w:space="0" w:color="auto"/>
-          <w:right w:val="single" w:sz="4" w:space="0" w:color="auto"/>
-          <w:insideH w:val="single" w:sz="4" w:space="0" w:color="auto"/>
-          <w:insideV w:val="single" w:sz="4" w:space="0" w:color="auto"/>
-        </w:tblBorders>
-        <w:tblCellMar>
-          <w:left w:w="10" w:type="dxa"/>
-          <w:right w:w="10" w:type="dxa"/>
-        </w:tblCellMar>
-        <w:tblLook w:val="0000" w:firstRow="0" w:lastRow="0" w:firstColumn="0" w:lastColumn="0" w:noHBand="0" w:noVBand="0"/>
-      </w:tblPr>
-      <w:tblGrid>
-        <w:gridCol w:w="9020"/>
-      </w:tblGrid>
-      <w:tr>
-        <w:tblPrEx>
-          <w:tblCellMar>
-            <w:top w:w="0" w:type="dxa"/>
-            <w:bottom w:w="0" w:type="dxa"/>
-          </w:tblCellMar>
-        </w:tblPrEx>
-        <w:tc>
-          <w:tcPr>
-            <w:tcW w:w="5000" w:type="pct"/>
-            <w:tcBorders>
-              <w:top w:val="dashed" w:sz="2" w:space="0" w:color="9CA3AF"/>
-              <w:left w:val="dashed" w:sz="2" w:space="0" w:color="9CA3AF"/>
-              <w:bottom w:val="dashed" w:sz="2" w:space="0" w:color="9CA3AF"/>
-              <w:right w:val="dashed" w:sz="2" w:space="0" w:color="9CA3AF"/>
-            </w:tcBorders>
-            <w:shd w:val="clear" w:color="auto" w:fill="F9FAFB"/>
-            <w:tcMar>
-              <w:top w:w="300" w:type="dxa"/>
-              <w:left w:w="200" w:type="dxa"/>
-              <w:bottom w:w="300" w:type="dxa"/>
-              <w:right w:w="200" w:type="dxa"/>
-            </w:tcMar>
-          </w:tcPr>
-          <w:p>
-            <w:pPr>
-              <w:jc w:val="center"/>
-            </w:pPr>
-            <w:r>
-              <w:rPr>
-                <w:b/>
-                <w:bCs/>
-                <w:color w:val="4B5563"/>
-              </w:rPr>
-              <w:t>📸 [DÁN ẢNH CHỤP MÀN HÌNH TẠI ĐÂY]</w:t>
-            </w:r>
-          </w:p>
-          <w:p>
-            <w:pPr>
-              <w:spacing w:before="80"/>
-              <w:jc w:val="center"/>
-            </w:pPr>
-            <w:r>
-              <w:rPr>
-                <w:i/>
-                <w:iCs/>
-                <w:color w:val="6B7280"/>
-                <w:sz w:val="18"/>
-                <w:szCs w:val="18"/>
-              </w:rPr>
-              <w:t>Chụp khi bấm tab "Đội nhóm" ở thanh điều hướng phía dưới</w:t>
-            </w:r>
-          </w:p>
-        </w:tc>
-      </w:tr>
-    </w:tbl>
+      </w:pPr>
+    </w:p>
+    <w:p>
+      <w:pPr>
+        <w:spacing w:before="240" w:after="80"/>
+        <w:rPr>
+          <w:b/>
+          <w:bCs/>
+          <w:color w:val="1E3A8A"/>
+        </w:rPr>
+      </w:pPr>
+    </w:p>
+    <w:p>
+      <w:pPr>
+        <w:spacing w:before="240" w:after="80"/>
+        <w:rPr>
+          <w:b/>
+          <w:bCs/>
+          <w:color w:val="1E3A8A"/>
+        </w:rPr>
+      </w:pPr>
+    </w:p>
+    <w:p>
+      <w:pPr>
+        <w:spacing w:before="240" w:after="80"/>
+        <w:rPr>
+          <w:b/>
+          <w:bCs/>
+          <w:color w:val="1E3A8A"/>
+        </w:rPr>
+      </w:pPr>
+    </w:p>
+    <w:p>
+      <w:pPr>
+        <w:spacing w:before="240" w:after="80"/>
+        <w:rPr>
+          <w:b/>
+          <w:bCs/>
+          <w:color w:val="1E3A8A"/>
+        </w:rPr>
+      </w:pPr>
+    </w:p>
+    <w:p>
+      <w:pPr>
+        <w:spacing w:before="240" w:after="80"/>
+        <w:rPr>
+          <w:b/>
+          <w:bCs/>
+          <w:color w:val="1E3A8A"/>
+        </w:rPr>
+      </w:pPr>
+    </w:p>
+    <w:p>
+      <w:pPr>
+        <w:spacing w:before="240" w:after="80"/>
+        <w:rPr>
+          <w:b/>
+          <w:bCs/>
+          <w:color w:val="1E3A8A"/>
+        </w:rPr>
+      </w:pPr>
+    </w:p>
+    <w:p>
+      <w:pPr>
+        <w:spacing w:before="240" w:after="80"/>
+        <w:rPr>
+          <w:b/>
+          <w:bCs/>
+          <w:color w:val="1E3A8A"/>
+        </w:rPr>
+      </w:pPr>
+    </w:p>
+    <w:p>
+      <w:pPr>
+        <w:spacing w:before="240" w:after="80"/>
+      </w:pPr>
+      <w:r>
+        <w:rPr>
+          <w:b/>
+          <w:bCs/>
+          <w:color w:val="1E3A8A"/>
+        </w:rPr>
+        <w:t>3.7. Ảnh 7: Chức năng Xóa công việc (Delete Task)</w:t>
+      </w:r>
+    </w:p>
+    <w:p>
+      <w:pPr>
+        <w:spacing w:before="100" w:after="200"/>
+        <w:rPr>
+          <w:color w:val="374151"/>
+          <w:sz w:val="19"/>
+          <w:szCs w:val="19"/>
+        </w:rPr>
+      </w:pPr>
+      <w:r>
+        <w:rPr>
+          <w:color w:val="374151"/>
+          <w:sz w:val="19"/>
+          <w:szCs w:val="19"/>
+        </w:rPr>
+        <w:lastRenderedPageBreak/>
+        <w:t xml:space="preserve">                            </w:t>
+      </w:r>
+      <w:r>
+        <w:rPr>
+          <w:color w:val="374151"/>
+          <w:sz w:val="19"/>
+          <w:szCs w:val="19"/>
+        </w:rPr>
+        <w:drawing>
+          <wp:inline distT="0" distB="0" distL="0" distR="0" wp14:anchorId="409EE533" wp14:editId="3C2F4C6E">
+            <wp:extent cx="1752600" cy="3894729"/>
+            <wp:effectExtent l="0" t="0" r="0" b="0"/>
+            <wp:docPr id="1274471857" name="Picture 1"/>
+            <wp:cNvGraphicFramePr>
+              <a:graphicFrameLocks xmlns:a="http://schemas.openxmlformats.org/drawingml/2006/main" noChangeAspect="1"/>
+            </wp:cNvGraphicFramePr>
+            <a:graphic xmlns:a="http://schemas.openxmlformats.org/drawingml/2006/main">
+              <a:graphicData uri="http://schemas.openxmlformats.org/drawingml/2006/picture">
+                <pic:pic xmlns:pic="http://schemas.openxmlformats.org/drawingml/2006/picture">
+                  <pic:nvPicPr>
+                    <pic:cNvPr id="1274471857" name=""/>
+                    <pic:cNvPicPr/>
+                  </pic:nvPicPr>
+                  <pic:blipFill>
+                    <a:blip r:embed="rId12"/>
+                    <a:stretch>
+                      <a:fillRect/>
+                    </a:stretch>
+                  </pic:blipFill>
+                  <pic:spPr>
+                    <a:xfrm>
+                      <a:off x="0" y="0"/>
+                      <a:ext cx="1763427" cy="3918790"/>
+                    </a:xfrm>
+                    <a:prstGeom prst="rect">
+                      <a:avLst/>
+                    </a:prstGeom>
+                  </pic:spPr>
+                </pic:pic>
+              </a:graphicData>
+            </a:graphic>
+          </wp:inline>
+        </w:drawing>
+      </w:r>
+      <w:r>
+        <w:rPr>
+          <w:color w:val="374151"/>
+          <w:sz w:val="19"/>
+          <w:szCs w:val="19"/>
+        </w:rPr>
+        <w:t xml:space="preserve">                   </w:t>
+      </w:r>
+      <w:r>
+        <w:rPr>
+          <w:color w:val="374151"/>
+          <w:sz w:val="19"/>
+          <w:szCs w:val="19"/>
+        </w:rPr>
+        <w:drawing>
+          <wp:inline distT="0" distB="0" distL="0" distR="0" wp14:anchorId="18ECDC35" wp14:editId="2E47C23E">
+            <wp:extent cx="1746477" cy="3881120"/>
+            <wp:effectExtent l="0" t="0" r="6350" b="5080"/>
+            <wp:docPr id="545978832" name="Picture 1"/>
+            <wp:cNvGraphicFramePr>
+              <a:graphicFrameLocks xmlns:a="http://schemas.openxmlformats.org/drawingml/2006/main" noChangeAspect="1"/>
+            </wp:cNvGraphicFramePr>
+            <a:graphic xmlns:a="http://schemas.openxmlformats.org/drawingml/2006/main">
+              <a:graphicData uri="http://schemas.openxmlformats.org/drawingml/2006/picture">
+                <pic:pic xmlns:pic="http://schemas.openxmlformats.org/drawingml/2006/picture">
+                  <pic:nvPicPr>
+                    <pic:cNvPr id="545978832" name=""/>
+                    <pic:cNvPicPr/>
+                  </pic:nvPicPr>
+                  <pic:blipFill>
+                    <a:blip r:embed="rId13"/>
+                    <a:stretch>
+                      <a:fillRect/>
+                    </a:stretch>
+                  </pic:blipFill>
+                  <pic:spPr>
+                    <a:xfrm>
+                      <a:off x="0" y="0"/>
+                      <a:ext cx="1758946" cy="3908828"/>
+                    </a:xfrm>
+                    <a:prstGeom prst="rect">
+                      <a:avLst/>
+                    </a:prstGeom>
+                  </pic:spPr>
+                </pic:pic>
+              </a:graphicData>
+            </a:graphic>
+          </wp:inline>
+        </w:drawing>
+      </w:r>
+      <w:r>
+        <w:rPr>
+          <w:color w:val="374151"/>
+          <w:sz w:val="19"/>
+          <w:szCs w:val="19"/>
+        </w:rPr>
+        <w:t xml:space="preserve">    </w:t>
+      </w:r>
+    </w:p>
+    <w:p>
+      <w:pPr>
+        <w:spacing w:before="100" w:after="200"/>
+        <w:rPr>
+          <w:color w:val="374151"/>
+          <w:sz w:val="19"/>
+          <w:szCs w:val="19"/>
+        </w:rPr>
+      </w:pPr>
+      <w:r>
+        <w:rPr>
+          <w:color w:val="374151"/>
+          <w:sz w:val="19"/>
+          <w:szCs w:val="19"/>
+        </w:rPr>
+        <w:t xml:space="preserve">Trước Khi xóa task: </w:t>
+      </w:r>
+    </w:p>
+    <w:p>
+      <w:pPr>
+        <w:spacing w:before="100" w:after="200"/>
+        <w:rPr>
+          <w:color w:val="374151"/>
+          <w:sz w:val="19"/>
+          <w:szCs w:val="19"/>
+        </w:rPr>
+      </w:pPr>
+      <w:r>
+        <w:rPr>
+          <w:color w:val="374151"/>
+          <w:sz w:val="19"/>
+          <w:szCs w:val="19"/>
+        </w:rPr>
+        <w:drawing>
+          <wp:inline distT="0" distB="0" distL="0" distR="0" wp14:anchorId="6C04AABB" wp14:editId="39A5748C">
+            <wp:extent cx="5731510" cy="3432175"/>
+            <wp:effectExtent l="0" t="0" r="2540" b="0"/>
+            <wp:docPr id="2117901802" name="Picture 1"/>
+            <wp:cNvGraphicFramePr>
+              <a:graphicFrameLocks xmlns:a="http://schemas.openxmlformats.org/drawingml/2006/main" noChangeAspect="1"/>
+            </wp:cNvGraphicFramePr>
+            <a:graphic xmlns:a="http://schemas.openxmlformats.org/drawingml/2006/main">
+              <a:graphicData uri="http://schemas.openxmlformats.org/drawingml/2006/picture">
+                <pic:pic xmlns:pic="http://schemas.openxmlformats.org/drawingml/2006/picture">
+                  <pic:nvPicPr>
+                    <pic:cNvPr id="2117901802" name=""/>
+                    <pic:cNvPicPr/>
+                  </pic:nvPicPr>
+                  <pic:blipFill>
+                    <a:blip r:embed="rId14"/>
+                    <a:stretch>
+                      <a:fillRect/>
+                    </a:stretch>
+                  </pic:blipFill>
+                  <pic:spPr>
+                    <a:xfrm>
+                      <a:off x="0" y="0"/>
+                      <a:ext cx="5731510" cy="3432175"/>
+                    </a:xfrm>
+                    <a:prstGeom prst="rect">
+                      <a:avLst/>
+                    </a:prstGeom>
+                  </pic:spPr>
+                </pic:pic>
+              </a:graphicData>
+            </a:graphic>
+          </wp:inline>
+        </w:drawing>
+      </w:r>
+    </w:p>
+    <w:p>
+      <w:pPr>
+        <w:spacing w:before="100" w:after="200"/>
+        <w:rPr>
+          <w:color w:val="374151"/>
+          <w:sz w:val="19"/>
+          <w:szCs w:val="19"/>
+        </w:rPr>
+      </w:pPr>
+      <w:r>
+        <w:rPr>
+          <w:color w:val="374151"/>
+          <w:sz w:val="19"/>
+          <w:szCs w:val="19"/>
+        </w:rPr>
+        <w:t>Sau khi xóa task:</w:t>
+      </w:r>
+    </w:p>
+    <w:p>
+      <w:pPr>
+        <w:spacing w:before="100" w:after="200"/>
+        <w:rPr>
+          <w:color w:val="374151"/>
+          <w:sz w:val="19"/>
+          <w:szCs w:val="19"/>
+        </w:rPr>
+      </w:pPr>
+      <w:r>
+        <w:rPr>
+          <w:color w:val="374151"/>
+          <w:sz w:val="19"/>
+          <w:szCs w:val="19"/>
+        </w:rPr>
+        <w:lastRenderedPageBreak/>
+        <w:drawing>
+          <wp:inline distT="0" distB="0" distL="0" distR="0" wp14:anchorId="1CFEB989" wp14:editId="6654B804">
+            <wp:extent cx="5981700" cy="2947773"/>
+            <wp:effectExtent l="0" t="0" r="0" b="5080"/>
+            <wp:docPr id="1073792495" name="Picture 1"/>
+            <wp:cNvGraphicFramePr>
+              <a:graphicFrameLocks xmlns:a="http://schemas.openxmlformats.org/drawingml/2006/main" noChangeAspect="1"/>
+            </wp:cNvGraphicFramePr>
+            <a:graphic xmlns:a="http://schemas.openxmlformats.org/drawingml/2006/main">
+              <a:graphicData uri="http://schemas.openxmlformats.org/drawingml/2006/picture">
+                <pic:pic xmlns:pic="http://schemas.openxmlformats.org/drawingml/2006/picture">
+                  <pic:nvPicPr>
+                    <pic:cNvPr id="1073792495" name=""/>
+                    <pic:cNvPicPr/>
+                  </pic:nvPicPr>
+                  <pic:blipFill>
+                    <a:blip r:embed="rId15"/>
+                    <a:stretch>
+                      <a:fillRect/>
+                    </a:stretch>
+                  </pic:blipFill>
+                  <pic:spPr>
+                    <a:xfrm>
+                      <a:off x="0" y="0"/>
+                      <a:ext cx="5992995" cy="2953339"/>
+                    </a:xfrm>
+                    <a:prstGeom prst="rect">
+                      <a:avLst/>
+                    </a:prstGeom>
+                  </pic:spPr>
+                </pic:pic>
+              </a:graphicData>
+            </a:graphic>
+          </wp:inline>
+        </w:drawing>
+      </w:r>
+    </w:p>
     <w:p>
       <w:pPr>
         <w:spacing w:before="100" w:after="200"/>
@@ -2454,6 +2529,90 @@
           <w:sz w:val="19"/>
           <w:szCs w:val="19"/>
         </w:rPr>
+        <w:t>Hình 7: Minh chứng chức năng Xóa (Delete): sau khi người dùng xác nhận tại hộp thoại cảnh báo, document tương ứng được xóa khỏi Firestore.</w:t>
+      </w:r>
+    </w:p>
+    <w:p>
+      <w:pPr>
+        <w:spacing w:before="240" w:after="80"/>
+      </w:pPr>
+      <w:r>
+        <w:rPr>
+          <w:b/>
+          <w:bCs/>
+          <w:color w:val="1E3A8A"/>
+        </w:rPr>
+        <w:t>3.8. Ảnh 8: Thanh Bottom Navigation &amp; Màn hình "Đội nhóm" (Teams Screen)</w:t>
+      </w:r>
+    </w:p>
+    <w:p>
+      <w:pPr>
+        <w:spacing w:before="100" w:after="200"/>
+        <w:jc w:val="center"/>
+        <w:rPr>
+          <w:color w:val="374151"/>
+          <w:sz w:val="19"/>
+          <w:szCs w:val="19"/>
+        </w:rPr>
+      </w:pPr>
+      <w:r>
+        <w:rPr>
+          <w:color w:val="374151"/>
+          <w:sz w:val="19"/>
+          <w:szCs w:val="19"/>
+        </w:rPr>
+        <w:drawing>
+          <wp:inline distT="0" distB="0" distL="0" distR="0" wp14:anchorId="01635A78" wp14:editId="5B925262">
+            <wp:extent cx="1841500" cy="4092287"/>
+            <wp:effectExtent l="0" t="0" r="6350" b="3810"/>
+            <wp:docPr id="1783019679" name="Picture 1"/>
+            <wp:cNvGraphicFramePr>
+              <a:graphicFrameLocks xmlns:a="http://schemas.openxmlformats.org/drawingml/2006/main" noChangeAspect="1"/>
+            </wp:cNvGraphicFramePr>
+            <a:graphic xmlns:a="http://schemas.openxmlformats.org/drawingml/2006/main">
+              <a:graphicData uri="http://schemas.openxmlformats.org/drawingml/2006/picture">
+                <pic:pic xmlns:pic="http://schemas.openxmlformats.org/drawingml/2006/picture">
+                  <pic:nvPicPr>
+                    <pic:cNvPr id="1783019679" name=""/>
+                    <pic:cNvPicPr/>
+                  </pic:nvPicPr>
+                  <pic:blipFill>
+                    <a:blip r:embed="rId16"/>
+                    <a:stretch>
+                      <a:fillRect/>
+                    </a:stretch>
+                  </pic:blipFill>
+                  <pic:spPr>
+                    <a:xfrm>
+                      <a:off x="0" y="0"/>
+                      <a:ext cx="1843798" cy="4097393"/>
+                    </a:xfrm>
+                    <a:prstGeom prst="rect">
+                      <a:avLst/>
+                    </a:prstGeom>
+                  </pic:spPr>
+                </pic:pic>
+              </a:graphicData>
+            </a:graphic>
+          </wp:inline>
+        </w:drawing>
+      </w:r>
+    </w:p>
+    <w:p>
+      <w:pPr>
+        <w:spacing w:before="100" w:after="200"/>
+        <w:jc w:val="center"/>
+      </w:pPr>
+      <w:r>
+        <w:rPr>
+          <w:b/>
+          <w:bCs/>
+          <w:i/>
+          <w:iCs/>
+          <w:color w:val="374151"/>
+          <w:sz w:val="19"/>
+          <w:szCs w:val="19"/>
+        </w:rPr>
         <w:t>Hình 8: Thanh Bottom Tab Navigation và màn hình placeholder "Coming Soon" của phân hệ Teams (chuẩn bị cho Practical Exam 2).</w:t>
       </w:r>
     </w:p>
@@ -2470,82 +2629,72 @@
         <w:t>3.9. Ảnh 9: Màn hình "Tài khoản" (Profile Screen)</w:t>
       </w:r>
     </w:p>
-    <w:tbl>
-      <w:tblPr>
-        <w:tblW w:w="5000" w:type="pct"/>
-        <w:tblBorders>
-          <w:top w:val="single" w:sz="4" w:space="0" w:color="auto"/>
-          <w:left w:val="single" w:sz="4" w:space="0" w:color="auto"/>
-          <w:bottom w:val="single" w:sz="4" w:space="0" w:color="auto"/>
-          <w:right w:val="single" w:sz="4" w:space="0" w:color="auto"/>
-          <w:insideH w:val="single" w:sz="4" w:space="0" w:color="auto"/>
-          <w:insideV w:val="single" w:sz="4" w:space="0" w:color="auto"/>
-        </w:tblBorders>
-        <w:tblCellMar>
-          <w:left w:w="10" w:type="dxa"/>
-          <w:right w:w="10" w:type="dxa"/>
-        </w:tblCellMar>
-        <w:tblLook w:val="0000" w:firstRow="0" w:lastRow="0" w:firstColumn="0" w:lastColumn="0" w:noHBand="0" w:noVBand="0"/>
-      </w:tblPr>
-      <w:tblGrid>
-        <w:gridCol w:w="9020"/>
-      </w:tblGrid>
-      <w:tr>
-        <w:tblPrEx>
-          <w:tblCellMar>
-            <w:top w:w="0" w:type="dxa"/>
-            <w:bottom w:w="0" w:type="dxa"/>
-          </w:tblCellMar>
-        </w:tblPrEx>
-        <w:tc>
-          <w:tcPr>
-            <w:tcW w:w="5000" w:type="pct"/>
-            <w:tcBorders>
-              <w:top w:val="dashed" w:sz="2" w:space="0" w:color="9CA3AF"/>
-              <w:left w:val="dashed" w:sz="2" w:space="0" w:color="9CA3AF"/>
-              <w:bottom w:val="dashed" w:sz="2" w:space="0" w:color="9CA3AF"/>
-              <w:right w:val="dashed" w:sz="2" w:space="0" w:color="9CA3AF"/>
-            </w:tcBorders>
-            <w:shd w:val="clear" w:color="auto" w:fill="F9FAFB"/>
-            <w:tcMar>
-              <w:top w:w="300" w:type="dxa"/>
-              <w:left w:w="200" w:type="dxa"/>
-              <w:bottom w:w="300" w:type="dxa"/>
-              <w:right w:w="200" w:type="dxa"/>
-            </w:tcMar>
-          </w:tcPr>
-          <w:p>
-            <w:pPr>
-              <w:jc w:val="center"/>
-            </w:pPr>
-            <w:r>
-              <w:rPr>
-                <w:b/>
-                <w:bCs/>
-                <w:color w:val="4B5563"/>
-              </w:rPr>
-              <w:t>📸 [DÁN ẢNH CHỤP MÀN HÌNH TẠI ĐÂY]</w:t>
-            </w:r>
-          </w:p>
-          <w:p>
-            <w:pPr>
-              <w:spacing w:before="80"/>
-              <w:jc w:val="center"/>
-            </w:pPr>
-            <w:r>
-              <w:rPr>
-                <w:i/>
-                <w:iCs/>
-                <w:color w:val="6B7280"/>
-                <w:sz w:val="18"/>
-                <w:szCs w:val="18"/>
-              </w:rPr>
-              <w:t>Chụp khi bấm tab "Tài khoản" ở thanh điều hướng phía dưới</w:t>
-            </w:r>
-          </w:p>
-        </w:tc>
-      </w:tr>
-    </w:tbl>
+    <w:p>
+      <w:pPr>
+        <w:spacing w:before="100" w:after="200"/>
+        <w:jc w:val="center"/>
+        <w:rPr>
+          <w:color w:val="374151"/>
+          <w:sz w:val="19"/>
+          <w:szCs w:val="19"/>
+        </w:rPr>
+      </w:pPr>
+      <w:r>
+        <w:rPr>
+          <w:color w:val="374151"/>
+          <w:sz w:val="19"/>
+          <w:szCs w:val="19"/>
+        </w:rPr>
+        <w:lastRenderedPageBreak/>
+        <w:drawing>
+          <wp:inline distT="0" distB="0" distL="0" distR="0" wp14:anchorId="4A258D37" wp14:editId="1D8BDB4A">
+            <wp:extent cx="1917700" cy="4261624"/>
+            <wp:effectExtent l="0" t="0" r="6350" b="5715"/>
+            <wp:docPr id="1264729266" name="Picture 1"/>
+            <wp:cNvGraphicFramePr>
+              <a:graphicFrameLocks xmlns:a="http://schemas.openxmlformats.org/drawingml/2006/main" noChangeAspect="1"/>
+            </wp:cNvGraphicFramePr>
+            <a:graphic xmlns:a="http://schemas.openxmlformats.org/drawingml/2006/main">
+              <a:graphicData uri="http://schemas.openxmlformats.org/drawingml/2006/picture">
+                <pic:pic xmlns:pic="http://schemas.openxmlformats.org/drawingml/2006/picture">
+                  <pic:nvPicPr>
+                    <pic:cNvPr id="1264729266" name=""/>
+                    <pic:cNvPicPr/>
+                  </pic:nvPicPr>
+                  <pic:blipFill>
+                    <a:blip r:embed="rId17"/>
+                    <a:stretch>
+                      <a:fillRect/>
+                    </a:stretch>
+                  </pic:blipFill>
+                  <pic:spPr>
+                    <a:xfrm>
+                      <a:off x="0" y="0"/>
+                      <a:ext cx="1920999" cy="4268956"/>
+                    </a:xfrm>
+                    <a:prstGeom prst="rect">
+                      <a:avLst/>
+                    </a:prstGeom>
+                  </pic:spPr>
+                </pic:pic>
+              </a:graphicData>
+            </a:graphic>
+          </wp:inline>
+        </w:drawing>
+      </w:r>
+    </w:p>
+    <w:p>
+      <w:pPr>
+        <w:spacing w:before="100" w:after="200"/>
+        <w:rPr>
+          <w:i/>
+          <w:iCs/>
+          <w:color w:val="374151"/>
+          <w:sz w:val="19"/>
+          <w:szCs w:val="19"/>
+        </w:rPr>
+      </w:pPr>
+    </w:p>
     <w:p>
       <w:pPr>
         <w:spacing w:before="100" w:after="200"/>
@@ -2679,7 +2828,6 @@
           <w:b/>
           <w:bCs/>
         </w:rPr>
-        <w:lastRenderedPageBreak/>
         <w:t xml:space="preserve">7. Kiến trúc mã nguồn sạch (Clean Modular Architecture): </w:t>
       </w:r>
       <w:r>
@@ -3288,7 +3436,6 @@
   <w:style w:type="character" w:default="1" w:styleId="DefaultParagraphFont">
     <w:name w:val="Default Paragraph Font"/>
     <w:uiPriority w:val="1"/>
-    <w:semiHidden/>
     <w:unhideWhenUsed/>
   </w:style>
   <w:style w:type="table" w:default="1" w:styleId="TableNormal">
@@ -3409,6 +3556,31 @@
     <w:rPr>
       <w:sz w:val="20"/>
       <w:szCs w:val="20"/>
+    </w:rPr>
+  </w:style>
+  <w:style w:type="character" w:styleId="UnresolvedMention">
+    <w:name w:val="Unresolved Mention"/>
+    <w:basedOn w:val="DefaultParagraphFont"/>
+    <w:uiPriority w:val="99"/>
+    <w:semiHidden/>
+    <w:unhideWhenUsed/>
+    <w:rsid w:val="00D27744"/>
+    <w:rPr>
+      <w:color w:val="605E5C"/>
+      <w:shd w:val="clear" w:color="auto" w:fill="E1DFDD"/>
+    </w:rPr>
+  </w:style>
+  <w:style w:type="paragraph" w:styleId="NormalWeb">
+    <w:name w:val="Normal (Web)"/>
+    <w:basedOn w:val="Normal"/>
+    <w:uiPriority w:val="99"/>
+    <w:semiHidden/>
+    <w:unhideWhenUsed/>
+    <w:rsid w:val="001D6D2D"/>
+    <w:rPr>
+      <w:rFonts w:ascii="Times New Roman" w:hAnsi="Times New Roman" w:cs="Times New Roman"/>
+      <w:sz w:val="24"/>
+      <w:szCs w:val="24"/>
     </w:rPr>
   </w:style>
 </w:styles>

</xml_diff>